<commit_message>
Remove CelNet Lab 9 and Expt No. 7 - BER MIMO files; update service worker cache and HTML/JS references accordingly.
</commit_message>
<xml_diff>
--- a/assets/CN_Practicals/CelNet Lab 1.docx
+++ b/assets/CN_Practicals/CelNet Lab 1.docx
@@ -1,6 +1,6 @@
 
 <file path=word/document.xml><?xml version="1.0" encoding="utf-8"?>
-<w:document xmlns:wpc="http://schemas.microsoft.com/office/word/2010/wordprocessingCanvas" xmlns:mc="http://schemas.openxmlformats.org/markup-compatibility/2006" xmlns:o="urn:schemas-microsoft-com:office:office" xmlns:r="http://schemas.openxmlformats.org/officeDocument/2006/relationships" xmlns:m="http://schemas.openxmlformats.org/officeDocument/2006/math" xmlns:v="urn:schemas-microsoft-com:vml" xmlns:wp14="http://schemas.microsoft.com/office/word/2010/wordprocessingDrawing" xmlns:wp="http://schemas.openxmlformats.org/drawingml/2006/wordprocessingDrawing" xmlns:w10="urn:schemas-microsoft-com:office:word" xmlns:w="http://schemas.openxmlformats.org/wordprocessingml/2006/main" xmlns:w14="http://schemas.microsoft.com/office/word/2010/wordml" xmlns:w15="http://schemas.microsoft.com/office/word/2012/wordml" xmlns:wpg="http://schemas.microsoft.com/office/word/2010/wordprocessingGroup" xmlns:wpi="http://schemas.microsoft.com/office/word/2010/wordprocessingInk" xmlns:wne="http://schemas.microsoft.com/office/word/2006/wordml" xmlns:wps="http://schemas.microsoft.com/office/word/2010/wordprocessingShape" mc:Ignorable="w14 w15 wp14">
+<w:document xmlns:wpc="http://schemas.microsoft.com/office/word/2010/wordprocessingCanvas" xmlns:cx="http://schemas.microsoft.com/office/drawing/2014/chartex" xmlns:cx1="http://schemas.microsoft.com/office/drawing/2015/9/8/chartex" xmlns:cx2="http://schemas.microsoft.com/office/drawing/2015/10/21/chartex" xmlns:cx3="http://schemas.microsoft.com/office/drawing/2016/5/9/chartex" xmlns:cx4="http://schemas.microsoft.com/office/drawing/2016/5/10/chartex" xmlns:cx5="http://schemas.microsoft.com/office/drawing/2016/5/11/chartex" xmlns:cx6="http://schemas.microsoft.com/office/drawing/2016/5/12/chartex" xmlns:cx7="http://schemas.microsoft.com/office/drawing/2016/5/13/chartex" xmlns:cx8="http://schemas.microsoft.com/office/drawing/2016/5/14/chartex" xmlns:mc="http://schemas.openxmlformats.org/markup-compatibility/2006" xmlns:aink="http://schemas.microsoft.com/office/drawing/2016/ink" xmlns:am3d="http://schemas.microsoft.com/office/drawing/2017/model3d" xmlns:o="urn:schemas-microsoft-com:office:office" xmlns:oel="http://schemas.microsoft.com/office/2019/extlst" xmlns:r="http://schemas.openxmlformats.org/officeDocument/2006/relationships" xmlns:m="http://schemas.openxmlformats.org/officeDocument/2006/math" xmlns:v="urn:schemas-microsoft-com:vml" xmlns:wp14="http://schemas.microsoft.com/office/word/2010/wordprocessingDrawing" xmlns:wp="http://schemas.openxmlformats.org/drawingml/2006/wordprocessingDrawing" xmlns:w10="urn:schemas-microsoft-com:office:word" xmlns:w="http://schemas.openxmlformats.org/wordprocessingml/2006/main" xmlns:w14="http://schemas.microsoft.com/office/word/2010/wordml" xmlns:w15="http://schemas.microsoft.com/office/word/2012/wordml" xmlns:w16cex="http://schemas.microsoft.com/office/word/2018/wordml/cex" xmlns:w16cid="http://schemas.microsoft.com/office/word/2016/wordml/cid" xmlns:w16="http://schemas.microsoft.com/office/word/2018/wordml" xmlns:w16du="http://schemas.microsoft.com/office/word/2023/wordml/word16du" xmlns:w16sdtdh="http://schemas.microsoft.com/office/word/2020/wordml/sdtdatahash" xmlns:w16sdtfl="http://schemas.microsoft.com/office/word/2024/wordml/sdtformatlock" xmlns:w16se="http://schemas.microsoft.com/office/word/2015/wordml/symex" xmlns:wpg="http://schemas.microsoft.com/office/word/2010/wordprocessingGroup" xmlns:wpi="http://schemas.microsoft.com/office/word/2010/wordprocessingInk" xmlns:wne="http://schemas.microsoft.com/office/word/2006/wordml" xmlns:wps="http://schemas.microsoft.com/office/word/2010/wordprocessingShape" mc:Ignorable="w14 w15 w16se w16cid w16 w16cex w16sdtdh w16sdtfl w16du wp14">
   <w:body>
     <w:tbl>
       <w:tblPr>
@@ -249,8 +249,6 @@
             <w:pPr>
               <w:jc w:val="center"/>
             </w:pPr>
-            <w:bookmarkStart w:id="0" w:name="_GoBack"/>
-            <w:bookmarkEnd w:id="0"/>
           </w:p>
           <w:p>
             <w:pPr>
@@ -339,6 +337,9 @@
                   <w:pPr>
                     <w:jc w:val="center"/>
                   </w:pPr>
+                  <w:r>
+                    <w:t>Aditya Ravindra Ghayal</w:t>
+                  </w:r>
                 </w:p>
               </w:tc>
             </w:tr>
@@ -369,6 +370,9 @@
                   <w:pPr>
                     <w:jc w:val="center"/>
                   </w:pPr>
+                  <w:r>
+                    <w:t>A</w:t>
+                  </w:r>
                 </w:p>
               </w:tc>
             </w:tr>
@@ -399,6 +403,9 @@
                   <w:pPr>
                     <w:jc w:val="center"/>
                   </w:pPr>
+                  <w:r>
+                    <w:t>023</w:t>
+                  </w:r>
                 </w:p>
               </w:tc>
             </w:tr>
@@ -762,23 +769,13 @@
                 <w:lang w:val="en-US"/>
               </w:rPr>
             </w:pPr>
-            <w:proofErr w:type="spellStart"/>
             <w:r>
               <w:rPr>
                 <w:rFonts w:ascii="Times New Roman" w:hAnsi="Times New Roman" w:cs="Times New Roman"/>
                 <w:szCs w:val="24"/>
                 <w:lang w:val="en-US"/>
               </w:rPr>
-              <w:t>Hata</w:t>
-            </w:r>
-            <w:proofErr w:type="spellEnd"/>
-            <w:r>
-              <w:rPr>
-                <w:rFonts w:ascii="Times New Roman" w:hAnsi="Times New Roman" w:cs="Times New Roman"/>
-                <w:szCs w:val="24"/>
-                <w:lang w:val="en-US"/>
-              </w:rPr>
-              <w:t xml:space="preserve"> Model for large city</w:t>
+              <w:t>Hata Model for large city</w:t>
             </w:r>
           </w:p>
         </w:tc>
@@ -910,14 +907,12 @@
         </w:rPr>
         <w:t xml:space="preserve"> </w:t>
       </w:r>
-      <w:proofErr w:type="spellStart"/>
       <w:r>
         <w:rPr>
           <w:lang w:val="en-IN" w:bidi="ar-SA"/>
         </w:rPr>
         <w:t>Hata</w:t>
       </w:r>
-      <w:proofErr w:type="spellEnd"/>
       <w:r>
         <w:rPr>
           <w:lang w:val="en-IN" w:bidi="ar-SA"/>
@@ -988,21 +983,7 @@
         <w:rPr>
           <w:lang w:val="en-IN" w:bidi="ar-SA"/>
         </w:rPr>
-        <w:t xml:space="preserve">frequencies of 2.1 GHz and 6 GHz. Assume transmit and receive antenna heights of 40 m and 2 m in a large city. Plot the graph of path loss </w:t>
-      </w:r>
-      <w:proofErr w:type="spellStart"/>
-      <w:r>
-        <w:rPr>
-          <w:lang w:val="en-IN" w:bidi="ar-SA"/>
-        </w:rPr>
-        <w:t>vs</w:t>
-      </w:r>
-      <w:proofErr w:type="spellEnd"/>
-      <w:r>
-        <w:rPr>
-          <w:lang w:val="en-IN" w:bidi="ar-SA"/>
-        </w:rPr>
-        <w:t xml:space="preserve"> distance.</w:t>
+        <w:t>frequencies of 2.1 GHz and 6 GHz. Assume transmit and receive antenna heights of 40 m and 2 m in a large city. Plot the graph of path loss vs distance.</w:t>
       </w:r>
     </w:p>
     <w:p>
@@ -1059,23 +1040,13 @@
           <w:szCs w:val="24"/>
         </w:rPr>
       </w:pPr>
-      <w:proofErr w:type="spellStart"/>
       <w:r>
         <w:rPr>
           <w:rFonts w:ascii="Times New Roman" w:eastAsia="Times New Roman" w:hAnsi="Times New Roman" w:cs="Times New Roman"/>
           <w:b/>
           <w:szCs w:val="24"/>
         </w:rPr>
-        <w:t>Hata</w:t>
-      </w:r>
-      <w:proofErr w:type="spellEnd"/>
-      <w:r>
-        <w:rPr>
-          <w:rFonts w:ascii="Times New Roman" w:eastAsia="Times New Roman" w:hAnsi="Times New Roman" w:cs="Times New Roman"/>
-          <w:b/>
-          <w:szCs w:val="24"/>
-        </w:rPr>
-        <w:t xml:space="preserve"> Model</w:t>
+        <w:t>Hata Model</w:t>
       </w:r>
     </w:p>
     <w:p>
@@ -1093,95 +1064,23 @@
           <w:color w:val="000000"/>
           <w:szCs w:val="24"/>
         </w:rPr>
-        <w:t xml:space="preserve">The </w:t>
-      </w:r>
-      <w:proofErr w:type="spellStart"/>
+        <w:t>The Hata model is a popular model for signal strength prediction proposed initially by the Japanese engineer Masaharu Hata in his 1980 paper titled “Empirical Formula for Propagation Loss in Land Mobile Radio Services</w:t>
+      </w:r>
       <w:r>
         <w:rPr>
           <w:rFonts w:ascii="Times New Roman" w:eastAsia="Times New Roman" w:hAnsi="Times New Roman" w:cs="Times New Roman"/>
           <w:color w:val="000000"/>
           <w:szCs w:val="24"/>
         </w:rPr>
-        <w:t>Hata</w:t>
-      </w:r>
-      <w:proofErr w:type="spellEnd"/>
+        <w:t>”</w:t>
+      </w:r>
       <w:r>
         <w:rPr>
           <w:rFonts w:ascii="Times New Roman" w:eastAsia="Times New Roman" w:hAnsi="Times New Roman" w:cs="Times New Roman"/>
           <w:color w:val="000000"/>
           <w:szCs w:val="24"/>
         </w:rPr>
-        <w:t xml:space="preserve"> model is a popular model for signal strength prediction proposed initially by the Japanese engineer </w:t>
-      </w:r>
-      <w:proofErr w:type="spellStart"/>
-      <w:r>
-        <w:rPr>
-          <w:rFonts w:ascii="Times New Roman" w:eastAsia="Times New Roman" w:hAnsi="Times New Roman" w:cs="Times New Roman"/>
-          <w:color w:val="000000"/>
-          <w:szCs w:val="24"/>
-        </w:rPr>
-        <w:t>Masaharu</w:t>
-      </w:r>
-      <w:proofErr w:type="spellEnd"/>
-      <w:r>
-        <w:rPr>
-          <w:rFonts w:ascii="Times New Roman" w:eastAsia="Times New Roman" w:hAnsi="Times New Roman" w:cs="Times New Roman"/>
-          <w:color w:val="000000"/>
-          <w:szCs w:val="24"/>
-        </w:rPr>
-        <w:t xml:space="preserve"> </w:t>
-      </w:r>
-      <w:proofErr w:type="spellStart"/>
-      <w:r>
-        <w:rPr>
-          <w:rFonts w:ascii="Times New Roman" w:eastAsia="Times New Roman" w:hAnsi="Times New Roman" w:cs="Times New Roman"/>
-          <w:color w:val="000000"/>
-          <w:szCs w:val="24"/>
-        </w:rPr>
-        <w:t>Hata</w:t>
-      </w:r>
-      <w:proofErr w:type="spellEnd"/>
-      <w:r>
-        <w:rPr>
-          <w:rFonts w:ascii="Times New Roman" w:eastAsia="Times New Roman" w:hAnsi="Times New Roman" w:cs="Times New Roman"/>
-          <w:color w:val="000000"/>
-          <w:szCs w:val="24"/>
-        </w:rPr>
-        <w:t xml:space="preserve"> in his 1980 paper titled “Empirical Formula for Propagation Loss in Land Mobile Radio Services</w:t>
-      </w:r>
-      <w:r>
-        <w:rPr>
-          <w:rFonts w:ascii="Times New Roman" w:eastAsia="Times New Roman" w:hAnsi="Times New Roman" w:cs="Times New Roman"/>
-          <w:color w:val="000000"/>
-          <w:szCs w:val="24"/>
-        </w:rPr>
-        <w:t>”</w:t>
-      </w:r>
-      <w:r>
-        <w:rPr>
-          <w:rFonts w:ascii="Times New Roman" w:eastAsia="Times New Roman" w:hAnsi="Times New Roman" w:cs="Times New Roman"/>
-          <w:color w:val="000000"/>
-          <w:szCs w:val="24"/>
-        </w:rPr>
-        <w:t xml:space="preserve">. The </w:t>
-      </w:r>
-      <w:proofErr w:type="spellStart"/>
-      <w:r>
-        <w:rPr>
-          <w:rFonts w:ascii="Times New Roman" w:eastAsia="Times New Roman" w:hAnsi="Times New Roman" w:cs="Times New Roman"/>
-          <w:color w:val="000000"/>
-          <w:szCs w:val="24"/>
-        </w:rPr>
-        <w:t>Hata</w:t>
-      </w:r>
-      <w:proofErr w:type="spellEnd"/>
-      <w:r>
-        <w:rPr>
-          <w:rFonts w:ascii="Times New Roman" w:eastAsia="Times New Roman" w:hAnsi="Times New Roman" w:cs="Times New Roman"/>
-          <w:color w:val="000000"/>
-          <w:szCs w:val="24"/>
-        </w:rPr>
-        <w:t xml:space="preserve"> model presents an analytical approximation for the graphical information based on another Okumura model. Parameters required for simulations:</w:t>
+        <w:t>. The Hata model presents an analytical approximation for the graphical information based on another Okumura model. Parameters required for simulations:</w:t>
       </w:r>
     </w:p>
     <w:p>
@@ -1684,7 +1583,6 @@
           <w:color w:val="000000"/>
           <w:szCs w:val="24"/>
         </w:rPr>
-        <w:lastRenderedPageBreak/>
         <w:t>Small &amp; Medium City (Urban model)</w:t>
       </w:r>
     </w:p>
@@ -2918,7 +2816,6 @@
                 <w:noProof/>
                 <w:lang w:val="en-US"/>
               </w:rPr>
-              <w:lastRenderedPageBreak/>
               <w:drawing>
                 <wp:inline distT="0" distB="0" distL="0" distR="0" wp14:anchorId="723AA452" wp14:editId="4EBED107">
                   <wp:extent cx="914400" cy="548681"/>
@@ -3173,23 +3070,13 @@
                 <w:lang w:val="en-US"/>
               </w:rPr>
             </w:pPr>
-            <w:proofErr w:type="spellStart"/>
             <w:r>
               <w:rPr>
                 <w:rFonts w:ascii="Times New Roman" w:hAnsi="Times New Roman" w:cs="Times New Roman"/>
                 <w:szCs w:val="24"/>
                 <w:lang w:val="en-US"/>
               </w:rPr>
-              <w:t>Hata</w:t>
-            </w:r>
-            <w:proofErr w:type="spellEnd"/>
-            <w:r>
-              <w:rPr>
-                <w:rFonts w:ascii="Times New Roman" w:hAnsi="Times New Roman" w:cs="Times New Roman"/>
-                <w:szCs w:val="24"/>
-                <w:lang w:val="en-US"/>
-              </w:rPr>
-              <w:t xml:space="preserve"> Model for large city</w:t>
+              <w:t>Hata Model for large city</w:t>
             </w:r>
           </w:p>
         </w:tc>
@@ -3381,14 +3268,12 @@
         </w:rPr>
         <w:t xml:space="preserve"> </w:t>
       </w:r>
-      <w:proofErr w:type="spellStart"/>
       <w:r>
         <w:rPr>
           <w:lang w:val="en-IN" w:bidi="ar-SA"/>
         </w:rPr>
         <w:t>Hata</w:t>
       </w:r>
-      <w:proofErr w:type="spellEnd"/>
       <w:r>
         <w:rPr>
           <w:lang w:val="en-IN" w:bidi="ar-SA"/>
@@ -3459,21 +3344,7 @@
         <w:rPr>
           <w:lang w:val="en-IN" w:bidi="ar-SA"/>
         </w:rPr>
-        <w:t xml:space="preserve">frequencies of 2.1 GHz and 6 GHz. Assume transmit and receive antenna heights of 40 m and 2 m in a large city. Plot the graph of path loss </w:t>
-      </w:r>
-      <w:proofErr w:type="spellStart"/>
-      <w:r>
-        <w:rPr>
-          <w:lang w:val="en-IN" w:bidi="ar-SA"/>
-        </w:rPr>
-        <w:t>vs</w:t>
-      </w:r>
-      <w:proofErr w:type="spellEnd"/>
-      <w:r>
-        <w:rPr>
-          <w:lang w:val="en-IN" w:bidi="ar-SA"/>
-        </w:rPr>
-        <w:t xml:space="preserve"> distance.</w:t>
+        <w:t>frequencies of 2.1 GHz and 6 GHz. Assume transmit and receive antenna heights of 40 m and 2 m in a large city. Plot the graph of path loss vs distance.</w:t>
       </w:r>
     </w:p>
     <w:p>
@@ -4561,15 +4432,7 @@
         </w:numPr>
       </w:pPr>
       <w:r>
-        <w:t>Explain free space propagation model (</w:t>
-      </w:r>
-      <w:proofErr w:type="spellStart"/>
-      <w:r>
-        <w:t>Friis</w:t>
-      </w:r>
-      <w:proofErr w:type="spellEnd"/>
-      <w:r>
-        <w:t xml:space="preserve"> Propagation Model).</w:t>
+        <w:t>Explain free space propagation model (Friis Propagation Model).</w:t>
       </w:r>
     </w:p>
     <w:p>
@@ -4593,15 +4456,7 @@
         </w:numPr>
       </w:pPr>
       <w:r>
-        <w:t xml:space="preserve">Employing the </w:t>
-      </w:r>
-      <w:proofErr w:type="spellStart"/>
-      <w:r>
-        <w:t>Hata</w:t>
-      </w:r>
-      <w:proofErr w:type="spellEnd"/>
-      <w:r>
-        <w:t xml:space="preserve"> model, compute the median loss at a distance d = 8 km, when the carrier frequency </w:t>
+        <w:t xml:space="preserve">Employing the Hata model, compute the median loss at a distance d = 8 km, when the carrier frequency </w:t>
       </w:r>
       <m:oMath>
         <m:r>
@@ -4695,7 +4550,6 @@
                 <w:noProof/>
                 <w:lang w:val="en-US"/>
               </w:rPr>
-              <w:lastRenderedPageBreak/>
               <w:drawing>
                 <wp:inline distT="0" distB="0" distL="0" distR="0" wp14:anchorId="7F7B48E4" wp14:editId="37A85B33">
                   <wp:extent cx="914400" cy="548681"/>
@@ -4950,23 +4804,13 @@
                 <w:lang w:val="en-US"/>
               </w:rPr>
             </w:pPr>
-            <w:proofErr w:type="spellStart"/>
             <w:r>
               <w:rPr>
                 <w:rFonts w:ascii="Times New Roman" w:hAnsi="Times New Roman" w:cs="Times New Roman"/>
                 <w:szCs w:val="24"/>
                 <w:lang w:val="en-US"/>
               </w:rPr>
-              <w:t>Hata</w:t>
-            </w:r>
-            <w:proofErr w:type="spellEnd"/>
-            <w:r>
-              <w:rPr>
-                <w:rFonts w:ascii="Times New Roman" w:hAnsi="Times New Roman" w:cs="Times New Roman"/>
-                <w:szCs w:val="24"/>
-                <w:lang w:val="en-US"/>
-              </w:rPr>
-              <w:t xml:space="preserve"> Model for large city</w:t>
+              <w:t>Hata Model for large city</w:t>
             </w:r>
           </w:p>
         </w:tc>
@@ -5488,25 +5332,14 @@
           <w:lang w:val="en-IN" w:eastAsia="en-IN"/>
         </w:rPr>
       </w:pPr>
-      <w:proofErr w:type="spellStart"/>
-      <w:r>
-        <w:rPr>
-          <w:rFonts w:ascii="Courier New" w:eastAsia="Times New Roman" w:hAnsi="Courier New" w:cs="Courier New"/>
-          <w:color w:val="212529"/>
-          <w:sz w:val="20"/>
-          <w:lang w:val="en-IN" w:eastAsia="en-IN"/>
-        </w:rPr>
-        <w:t>Hm</w:t>
-      </w:r>
-      <w:proofErr w:type="spellEnd"/>
-      <w:r>
-        <w:rPr>
-          <w:rFonts w:ascii="Courier New" w:eastAsia="Times New Roman" w:hAnsi="Courier New" w:cs="Courier New"/>
-          <w:color w:val="212529"/>
-          <w:sz w:val="20"/>
-          <w:lang w:val="en-IN" w:eastAsia="en-IN"/>
-        </w:rPr>
-        <w:t xml:space="preserve"> = </w:t>
+      <w:r>
+        <w:rPr>
+          <w:rFonts w:ascii="Courier New" w:eastAsia="Times New Roman" w:hAnsi="Courier New" w:cs="Courier New"/>
+          <w:color w:val="212529"/>
+          <w:sz w:val="20"/>
+          <w:lang w:val="en-IN" w:eastAsia="en-IN"/>
+        </w:rPr>
+        <w:t xml:space="preserve">Hm = </w:t>
       </w:r>
       <w:r>
         <w:rPr>
@@ -5685,27 +5518,7 @@
           <w:sz w:val="20"/>
           <w:lang w:val="en-IN" w:eastAsia="en-IN"/>
         </w:rPr>
-        <w:t xml:space="preserve">%Range of </w:t>
-      </w:r>
-      <w:proofErr w:type="spellStart"/>
-      <w:r>
-        <w:rPr>
-          <w:rFonts w:ascii="Courier New" w:eastAsia="Times New Roman" w:hAnsi="Courier New" w:cs="Courier New"/>
-          <w:color w:val="228B22"/>
-          <w:sz w:val="20"/>
-          <w:lang w:val="en-IN" w:eastAsia="en-IN"/>
-        </w:rPr>
-        <w:t>Tx</w:t>
-      </w:r>
-      <w:proofErr w:type="spellEnd"/>
-      <w:r>
-        <w:rPr>
-          <w:rFonts w:ascii="Courier New" w:eastAsia="Times New Roman" w:hAnsi="Courier New" w:cs="Courier New"/>
-          <w:color w:val="228B22"/>
-          <w:sz w:val="20"/>
-          <w:lang w:val="en-IN" w:eastAsia="en-IN"/>
-        </w:rPr>
-        <w:t xml:space="preserve">-Rx separation distances in </w:t>
+        <w:t xml:space="preserve">%Range of Tx-Rx separation distances in </w:t>
       </w:r>
       <w:proofErr w:type="spellStart"/>
       <w:r>
@@ -5740,25 +5553,14 @@
           <w:lang w:val="en-IN" w:eastAsia="en-IN"/>
         </w:rPr>
       </w:pPr>
-      <w:proofErr w:type="spellStart"/>
-      <w:r>
-        <w:rPr>
-          <w:rFonts w:ascii="Courier New" w:eastAsia="Times New Roman" w:hAnsi="Courier New" w:cs="Courier New"/>
-          <w:color w:val="212529"/>
-          <w:sz w:val="20"/>
-          <w:lang w:val="en-IN" w:eastAsia="en-IN"/>
-        </w:rPr>
-        <w:t>Pt</w:t>
-      </w:r>
-      <w:proofErr w:type="spellEnd"/>
-      <w:r>
-        <w:rPr>
-          <w:rFonts w:ascii="Courier New" w:eastAsia="Times New Roman" w:hAnsi="Courier New" w:cs="Courier New"/>
-          <w:color w:val="212529"/>
-          <w:sz w:val="20"/>
-          <w:lang w:val="en-IN" w:eastAsia="en-IN"/>
-        </w:rPr>
-        <w:t xml:space="preserve"> = </w:t>
+      <w:r>
+        <w:rPr>
+          <w:rFonts w:ascii="Courier New" w:eastAsia="Times New Roman" w:hAnsi="Courier New" w:cs="Courier New"/>
+          <w:color w:val="212529"/>
+          <w:sz w:val="20"/>
+          <w:lang w:val="en-IN" w:eastAsia="en-IN"/>
+        </w:rPr>
+        <w:t xml:space="preserve">Pt = </w:t>
       </w:r>
       <w:r>
         <w:rPr>
@@ -5809,25 +5611,14 @@
           <w:lang w:val="en-IN" w:eastAsia="en-IN"/>
         </w:rPr>
       </w:pPr>
-      <w:proofErr w:type="spellStart"/>
-      <w:r>
-        <w:rPr>
-          <w:rFonts w:ascii="Courier New" w:eastAsia="Times New Roman" w:hAnsi="Courier New" w:cs="Courier New"/>
-          <w:color w:val="212529"/>
-          <w:sz w:val="20"/>
-          <w:lang w:val="en-IN" w:eastAsia="en-IN"/>
-        </w:rPr>
-        <w:t>Gt</w:t>
-      </w:r>
-      <w:proofErr w:type="spellEnd"/>
-      <w:r>
-        <w:rPr>
-          <w:rFonts w:ascii="Courier New" w:eastAsia="Times New Roman" w:hAnsi="Courier New" w:cs="Courier New"/>
-          <w:color w:val="212529"/>
-          <w:sz w:val="20"/>
-          <w:lang w:val="en-IN" w:eastAsia="en-IN"/>
-        </w:rPr>
-        <w:t xml:space="preserve"> = </w:t>
+      <w:r>
+        <w:rPr>
+          <w:rFonts w:ascii="Courier New" w:eastAsia="Times New Roman" w:hAnsi="Courier New" w:cs="Courier New"/>
+          <w:color w:val="212529"/>
+          <w:sz w:val="20"/>
+          <w:lang w:val="en-IN" w:eastAsia="en-IN"/>
+        </w:rPr>
+        <w:t xml:space="preserve">Gt = </w:t>
       </w:r>
       <w:r>
         <w:rPr>
@@ -5920,25 +5711,14 @@
           <w:lang w:val="en-IN" w:eastAsia="en-IN"/>
         </w:rPr>
       </w:pPr>
-      <w:proofErr w:type="spellStart"/>
-      <w:r>
-        <w:rPr>
-          <w:rFonts w:ascii="Courier New" w:eastAsia="Times New Roman" w:hAnsi="Courier New" w:cs="Courier New"/>
-          <w:color w:val="212529"/>
-          <w:sz w:val="20"/>
-          <w:lang w:val="en-IN" w:eastAsia="en-IN"/>
-        </w:rPr>
-        <w:t>Hb</w:t>
-      </w:r>
-      <w:proofErr w:type="spellEnd"/>
-      <w:r>
-        <w:rPr>
-          <w:rFonts w:ascii="Courier New" w:eastAsia="Times New Roman" w:hAnsi="Courier New" w:cs="Courier New"/>
-          <w:color w:val="212529"/>
-          <w:sz w:val="20"/>
-          <w:lang w:val="en-IN" w:eastAsia="en-IN"/>
-        </w:rPr>
-        <w:t xml:space="preserve"> = </w:t>
+      <w:r>
+        <w:rPr>
+          <w:rFonts w:ascii="Courier New" w:eastAsia="Times New Roman" w:hAnsi="Courier New" w:cs="Courier New"/>
+          <w:color w:val="212529"/>
+          <w:sz w:val="20"/>
+          <w:lang w:val="en-IN" w:eastAsia="en-IN"/>
+        </w:rPr>
+        <w:t xml:space="preserve">Hb = </w:t>
       </w:r>
       <w:proofErr w:type="spellStart"/>
       <w:r>
@@ -6161,19 +5941,8 @@
           <w:sz w:val="20"/>
           <w:lang w:val="en-IN" w:eastAsia="en-IN"/>
         </w:rPr>
-        <w:t xml:space="preserve"> * </w:t>
-      </w:r>
-      <w:proofErr w:type="spellStart"/>
-      <w:r>
-        <w:rPr>
-          <w:rFonts w:ascii="Courier New" w:eastAsia="Times New Roman" w:hAnsi="Courier New" w:cs="Courier New"/>
-          <w:color w:val="212529"/>
-          <w:sz w:val="20"/>
-          <w:lang w:val="en-IN" w:eastAsia="en-IN"/>
-        </w:rPr>
-        <w:t>Hm</w:t>
-      </w:r>
-      <w:proofErr w:type="spellEnd"/>
+        <w:t xml:space="preserve"> * Hm</w:t>
+      </w:r>
       <w:r>
         <w:rPr>
           <w:rFonts w:ascii="Courier New" w:eastAsia="Times New Roman" w:hAnsi="Courier New" w:cs="Courier New"/>
@@ -6407,7 +6176,6 @@
         </w:rPr>
         <w:t>(</w:t>
       </w:r>
-      <w:proofErr w:type="spellStart"/>
       <w:r>
         <w:rPr>
           <w:rFonts w:ascii="Courier New" w:eastAsia="Times New Roman" w:hAnsi="Courier New" w:cs="Courier New"/>
@@ -6417,7 +6185,6 @@
         </w:rPr>
         <w:t>Hb</w:t>
       </w:r>
-      <w:proofErr w:type="spellEnd"/>
       <w:r>
         <w:rPr>
           <w:rFonts w:ascii="Courier New" w:eastAsia="Times New Roman" w:hAnsi="Courier New" w:cs="Courier New"/>
@@ -6541,7 +6308,6 @@
         </w:rPr>
         <w:t>(</w:t>
       </w:r>
-      <w:proofErr w:type="spellStart"/>
       <w:r>
         <w:rPr>
           <w:rFonts w:ascii="Courier New" w:eastAsia="Times New Roman" w:hAnsi="Courier New" w:cs="Courier New"/>
@@ -6551,7 +6317,6 @@
         </w:rPr>
         <w:t>Hb</w:t>
       </w:r>
-      <w:proofErr w:type="spellEnd"/>
       <w:r>
         <w:rPr>
           <w:rFonts w:ascii="Courier New" w:eastAsia="Times New Roman" w:hAnsi="Courier New" w:cs="Courier New"/>
@@ -6950,27 +6715,7 @@
           <w:sz w:val="20"/>
           <w:lang w:val="en-IN" w:eastAsia="en-IN"/>
         </w:rPr>
-        <w:t>'</w:t>
-      </w:r>
-      <w:proofErr w:type="spellStart"/>
-      <w:r>
-        <w:rPr>
-          <w:rFonts w:ascii="Courier New" w:eastAsia="Times New Roman" w:hAnsi="Courier New" w:cs="Courier New"/>
-          <w:color w:val="A020F0"/>
-          <w:sz w:val="20"/>
-          <w:lang w:val="en-IN" w:eastAsia="en-IN"/>
-        </w:rPr>
-        <w:t>Hata</w:t>
-      </w:r>
-      <w:proofErr w:type="spellEnd"/>
-      <w:r>
-        <w:rPr>
-          <w:rFonts w:ascii="Courier New" w:eastAsia="Times New Roman" w:hAnsi="Courier New" w:cs="Courier New"/>
-          <w:color w:val="A020F0"/>
-          <w:sz w:val="20"/>
-          <w:lang w:val="en-IN" w:eastAsia="en-IN"/>
-        </w:rPr>
-        <w:t>-Okumura Path Loss Model'</w:t>
+        <w:t>'Hata-Okumura Path Loss Model'</w:t>
       </w:r>
       <w:r>
         <w:rPr>
@@ -7365,25 +7110,14 @@
         </w:rPr>
         <w:t>(</w:t>
       </w:r>
-      <w:proofErr w:type="spellStart"/>
-      <w:r>
-        <w:rPr>
-          <w:rFonts w:ascii="Courier New" w:eastAsia="Times New Roman" w:hAnsi="Courier New" w:cs="Courier New"/>
-          <w:color w:val="212529"/>
-          <w:sz w:val="20"/>
-          <w:lang w:val="en-IN" w:eastAsia="en-IN"/>
-        </w:rPr>
-        <w:t>Pt</w:t>
-      </w:r>
-      <w:proofErr w:type="spellEnd"/>
-      <w:r>
-        <w:rPr>
-          <w:rFonts w:ascii="Courier New" w:eastAsia="Times New Roman" w:hAnsi="Courier New" w:cs="Courier New"/>
-          <w:color w:val="212529"/>
-          <w:sz w:val="20"/>
-          <w:lang w:val="en-IN" w:eastAsia="en-IN"/>
-        </w:rPr>
-        <w:t xml:space="preserve"> * </w:t>
+      <w:r>
+        <w:rPr>
+          <w:rFonts w:ascii="Courier New" w:eastAsia="Times New Roman" w:hAnsi="Courier New" w:cs="Courier New"/>
+          <w:color w:val="212529"/>
+          <w:sz w:val="20"/>
+          <w:lang w:val="en-IN" w:eastAsia="en-IN"/>
+        </w:rPr>
+        <w:t xml:space="preserve">Pt * </w:t>
       </w:r>
       <w:r>
         <w:rPr>
@@ -7410,27 +7144,7 @@
           <w:sz w:val="20"/>
           <w:lang w:val="en-IN" w:eastAsia="en-IN"/>
         </w:rPr>
-        <w:t xml:space="preserve"> + </w:t>
-      </w:r>
-      <w:proofErr w:type="spellStart"/>
-      <w:r>
-        <w:rPr>
-          <w:rFonts w:ascii="Courier New" w:eastAsia="Times New Roman" w:hAnsi="Courier New" w:cs="Courier New"/>
-          <w:color w:val="212529"/>
-          <w:sz w:val="20"/>
-          <w:lang w:val="en-IN" w:eastAsia="en-IN"/>
-        </w:rPr>
-        <w:t>Gt</w:t>
-      </w:r>
-      <w:proofErr w:type="spellEnd"/>
-      <w:r>
-        <w:rPr>
-          <w:rFonts w:ascii="Courier New" w:eastAsia="Times New Roman" w:hAnsi="Courier New" w:cs="Courier New"/>
-          <w:color w:val="212529"/>
-          <w:sz w:val="20"/>
-          <w:lang w:val="en-IN" w:eastAsia="en-IN"/>
-        </w:rPr>
-        <w:t xml:space="preserve"> - PL</w:t>
+        <w:t xml:space="preserve"> + Gt - PL</w:t>
       </w:r>
     </w:p>
     <w:p>
@@ -7725,27 +7439,7 @@
           <w:sz w:val="20"/>
           <w:lang w:val="en-IN" w:eastAsia="en-IN"/>
         </w:rPr>
-        <w:t>'</w:t>
-      </w:r>
-      <w:proofErr w:type="spellStart"/>
-      <w:r>
-        <w:rPr>
-          <w:rFonts w:ascii="Courier New" w:eastAsia="Times New Roman" w:hAnsi="Courier New" w:cs="Courier New"/>
-          <w:color w:val="A020F0"/>
-          <w:sz w:val="20"/>
-          <w:lang w:val="en-IN" w:eastAsia="en-IN"/>
-        </w:rPr>
-        <w:t>Hata</w:t>
-      </w:r>
-      <w:proofErr w:type="spellEnd"/>
-      <w:r>
-        <w:rPr>
-          <w:rFonts w:ascii="Courier New" w:eastAsia="Times New Roman" w:hAnsi="Courier New" w:cs="Courier New"/>
-          <w:color w:val="A020F0"/>
-          <w:sz w:val="20"/>
-          <w:lang w:val="en-IN" w:eastAsia="en-IN"/>
-        </w:rPr>
-        <w:t>-Okumura Model'</w:t>
+        <w:t>'Hata-Okumura Model'</w:t>
       </w:r>
       <w:r>
         <w:rPr>
@@ -7975,27 +7669,7 @@
           <w:sz w:val="20"/>
           <w:lang w:val="en-IN" w:eastAsia="en-IN"/>
         </w:rPr>
-        <w:t>'Received Signal Level (</w:t>
-      </w:r>
-      <w:proofErr w:type="spellStart"/>
-      <w:r>
-        <w:rPr>
-          <w:rFonts w:ascii="Courier New" w:eastAsia="Times New Roman" w:hAnsi="Courier New" w:cs="Courier New"/>
-          <w:color w:val="A020F0"/>
-          <w:sz w:val="20"/>
-          <w:lang w:val="en-IN" w:eastAsia="en-IN"/>
-        </w:rPr>
-        <w:t>dBm</w:t>
-      </w:r>
-      <w:proofErr w:type="spellEnd"/>
-      <w:r>
-        <w:rPr>
-          <w:rFonts w:ascii="Courier New" w:eastAsia="Times New Roman" w:hAnsi="Courier New" w:cs="Courier New"/>
-          <w:color w:val="A020F0"/>
-          <w:sz w:val="20"/>
-          <w:lang w:val="en-IN" w:eastAsia="en-IN"/>
-        </w:rPr>
-        <w:t>)'</w:t>
+        <w:t>'Received Signal Level (dBm)'</w:t>
       </w:r>
       <w:r>
         <w:rPr>
@@ -8070,7 +7744,6 @@
         <w:rPr>
           <w:rFonts w:eastAsia="Courier New"/>
         </w:rPr>
-        <w:lastRenderedPageBreak/>
         <w:t>Output</w:t>
       </w:r>
     </w:p>
@@ -8293,7 +7966,7 @@
 </file>
 
 <file path=word/endnotes.xml><?xml version="1.0" encoding="utf-8"?>
-<w:endnotes xmlns:wpc="http://schemas.microsoft.com/office/word/2010/wordprocessingCanvas" xmlns:mc="http://schemas.openxmlformats.org/markup-compatibility/2006" xmlns:o="urn:schemas-microsoft-com:office:office" xmlns:r="http://schemas.openxmlformats.org/officeDocument/2006/relationships" xmlns:m="http://schemas.openxmlformats.org/officeDocument/2006/math" xmlns:v="urn:schemas-microsoft-com:vml" xmlns:wp14="http://schemas.microsoft.com/office/word/2010/wordprocessingDrawing" xmlns:wp="http://schemas.openxmlformats.org/drawingml/2006/wordprocessingDrawing" xmlns:w10="urn:schemas-microsoft-com:office:word" xmlns:w="http://schemas.openxmlformats.org/wordprocessingml/2006/main" xmlns:w14="http://schemas.microsoft.com/office/word/2010/wordml" xmlns:w15="http://schemas.microsoft.com/office/word/2012/wordml" xmlns:wpg="http://schemas.microsoft.com/office/word/2010/wordprocessingGroup" xmlns:wpi="http://schemas.microsoft.com/office/word/2010/wordprocessingInk" xmlns:wne="http://schemas.microsoft.com/office/word/2006/wordml" xmlns:wps="http://schemas.microsoft.com/office/word/2010/wordprocessingShape" mc:Ignorable="w14 w15 wp14">
+<w:endnotes xmlns:wpc="http://schemas.microsoft.com/office/word/2010/wordprocessingCanvas" xmlns:cx="http://schemas.microsoft.com/office/drawing/2014/chartex" xmlns:cx1="http://schemas.microsoft.com/office/drawing/2015/9/8/chartex" xmlns:cx2="http://schemas.microsoft.com/office/drawing/2015/10/21/chartex" xmlns:cx3="http://schemas.microsoft.com/office/drawing/2016/5/9/chartex" xmlns:cx4="http://schemas.microsoft.com/office/drawing/2016/5/10/chartex" xmlns:cx5="http://schemas.microsoft.com/office/drawing/2016/5/11/chartex" xmlns:cx6="http://schemas.microsoft.com/office/drawing/2016/5/12/chartex" xmlns:cx7="http://schemas.microsoft.com/office/drawing/2016/5/13/chartex" xmlns:cx8="http://schemas.microsoft.com/office/drawing/2016/5/14/chartex" xmlns:mc="http://schemas.openxmlformats.org/markup-compatibility/2006" xmlns:aink="http://schemas.microsoft.com/office/drawing/2016/ink" xmlns:am3d="http://schemas.microsoft.com/office/drawing/2017/model3d" xmlns:o="urn:schemas-microsoft-com:office:office" xmlns:oel="http://schemas.microsoft.com/office/2019/extlst" xmlns:r="http://schemas.openxmlformats.org/officeDocument/2006/relationships" xmlns:m="http://schemas.openxmlformats.org/officeDocument/2006/math" xmlns:v="urn:schemas-microsoft-com:vml" xmlns:wp14="http://schemas.microsoft.com/office/word/2010/wordprocessingDrawing" xmlns:wp="http://schemas.openxmlformats.org/drawingml/2006/wordprocessingDrawing" xmlns:w10="urn:schemas-microsoft-com:office:word" xmlns:w="http://schemas.openxmlformats.org/wordprocessingml/2006/main" xmlns:w14="http://schemas.microsoft.com/office/word/2010/wordml" xmlns:w15="http://schemas.microsoft.com/office/word/2012/wordml" xmlns:w16cex="http://schemas.microsoft.com/office/word/2018/wordml/cex" xmlns:w16cid="http://schemas.microsoft.com/office/word/2016/wordml/cid" xmlns:w16="http://schemas.microsoft.com/office/word/2018/wordml" xmlns:w16du="http://schemas.microsoft.com/office/word/2023/wordml/word16du" xmlns:w16sdtdh="http://schemas.microsoft.com/office/word/2020/wordml/sdtdatahash" xmlns:w16sdtfl="http://schemas.microsoft.com/office/word/2024/wordml/sdtformatlock" xmlns:w16se="http://schemas.microsoft.com/office/word/2015/wordml/symex" xmlns:wpg="http://schemas.microsoft.com/office/word/2010/wordprocessingGroup" xmlns:wpi="http://schemas.microsoft.com/office/word/2010/wordprocessingInk" xmlns:wne="http://schemas.microsoft.com/office/word/2006/wordml" xmlns:wps="http://schemas.microsoft.com/office/word/2010/wordprocessingShape" mc:Ignorable="w14 w15 w16se w16cid w16 w16cex w16sdtdh w16sdtfl w16du wp14">
   <w:endnote w:type="separator" w:id="-1">
     <w:p>
       <w:pPr>
@@ -8318,7 +7991,7 @@
 </file>
 
 <file path=word/footer1.xml><?xml version="1.0" encoding="utf-8"?>
-<w:ftr xmlns:wpc="http://schemas.microsoft.com/office/word/2010/wordprocessingCanvas" xmlns:mc="http://schemas.openxmlformats.org/markup-compatibility/2006" xmlns:o="urn:schemas-microsoft-com:office:office" xmlns:r="http://schemas.openxmlformats.org/officeDocument/2006/relationships" xmlns:m="http://schemas.openxmlformats.org/officeDocument/2006/math" xmlns:v="urn:schemas-microsoft-com:vml" xmlns:wp14="http://schemas.microsoft.com/office/word/2010/wordprocessingDrawing" xmlns:wp="http://schemas.openxmlformats.org/drawingml/2006/wordprocessingDrawing" xmlns:w10="urn:schemas-microsoft-com:office:word" xmlns:w="http://schemas.openxmlformats.org/wordprocessingml/2006/main" xmlns:w14="http://schemas.microsoft.com/office/word/2010/wordml" xmlns:w15="http://schemas.microsoft.com/office/word/2012/wordml" xmlns:wpg="http://schemas.microsoft.com/office/word/2010/wordprocessingGroup" xmlns:wpi="http://schemas.microsoft.com/office/word/2010/wordprocessingInk" xmlns:wne="http://schemas.microsoft.com/office/word/2006/wordml" xmlns:wps="http://schemas.microsoft.com/office/word/2010/wordprocessingShape" mc:Ignorable="w14 w15 wp14">
+<w:ftr xmlns:wpc="http://schemas.microsoft.com/office/word/2010/wordprocessingCanvas" xmlns:cx="http://schemas.microsoft.com/office/drawing/2014/chartex" xmlns:cx1="http://schemas.microsoft.com/office/drawing/2015/9/8/chartex" xmlns:cx2="http://schemas.microsoft.com/office/drawing/2015/10/21/chartex" xmlns:cx3="http://schemas.microsoft.com/office/drawing/2016/5/9/chartex" xmlns:cx4="http://schemas.microsoft.com/office/drawing/2016/5/10/chartex" xmlns:cx5="http://schemas.microsoft.com/office/drawing/2016/5/11/chartex" xmlns:cx6="http://schemas.microsoft.com/office/drawing/2016/5/12/chartex" xmlns:cx7="http://schemas.microsoft.com/office/drawing/2016/5/13/chartex" xmlns:cx8="http://schemas.microsoft.com/office/drawing/2016/5/14/chartex" xmlns:mc="http://schemas.openxmlformats.org/markup-compatibility/2006" xmlns:aink="http://schemas.microsoft.com/office/drawing/2016/ink" xmlns:am3d="http://schemas.microsoft.com/office/drawing/2017/model3d" xmlns:o="urn:schemas-microsoft-com:office:office" xmlns:oel="http://schemas.microsoft.com/office/2019/extlst" xmlns:r="http://schemas.openxmlformats.org/officeDocument/2006/relationships" xmlns:m="http://schemas.openxmlformats.org/officeDocument/2006/math" xmlns:v="urn:schemas-microsoft-com:vml" xmlns:wp14="http://schemas.microsoft.com/office/word/2010/wordprocessingDrawing" xmlns:wp="http://schemas.openxmlformats.org/drawingml/2006/wordprocessingDrawing" xmlns:w10="urn:schemas-microsoft-com:office:word" xmlns:w="http://schemas.openxmlformats.org/wordprocessingml/2006/main" xmlns:w14="http://schemas.microsoft.com/office/word/2010/wordml" xmlns:w15="http://schemas.microsoft.com/office/word/2012/wordml" xmlns:w16cex="http://schemas.microsoft.com/office/word/2018/wordml/cex" xmlns:w16cid="http://schemas.microsoft.com/office/word/2016/wordml/cid" xmlns:w16="http://schemas.microsoft.com/office/word/2018/wordml" xmlns:w16du="http://schemas.microsoft.com/office/word/2023/wordml/word16du" xmlns:w16sdtdh="http://schemas.microsoft.com/office/word/2020/wordml/sdtdatahash" xmlns:w16sdtfl="http://schemas.microsoft.com/office/word/2024/wordml/sdtformatlock" xmlns:w16se="http://schemas.microsoft.com/office/word/2015/wordml/symex" xmlns:wpg="http://schemas.microsoft.com/office/word/2010/wordprocessingGroup" xmlns:wpi="http://schemas.microsoft.com/office/word/2010/wordprocessingInk" xmlns:wne="http://schemas.microsoft.com/office/word/2006/wordml" xmlns:wps="http://schemas.microsoft.com/office/word/2010/wordprocessingShape" mc:Ignorable="w14 w15 w16se w16cid w16 w16cex w16sdtdh w16sdtfl w16du wp14">
   <w:p>
     <w:pPr>
       <w:pStyle w:val="Footer"/>
@@ -8390,7 +8063,7 @@
             </wp:anchor>
           </w:drawing>
         </mc:Choice>
-        <mc:Fallback xmlns:w16se="http://schemas.microsoft.com/office/word/2015/wordml/symex" xmlns:w16sdtdh="http://schemas.microsoft.com/office/word/2020/wordml/sdtdatahash" xmlns:w16="http://schemas.microsoft.com/office/word/2018/wordml" xmlns:w16cid="http://schemas.microsoft.com/office/word/2016/wordml/cid" xmlns:w16cex="http://schemas.microsoft.com/office/word/2018/wordml/cex" xmlns:am3d="http://schemas.microsoft.com/office/drawing/2017/model3d" xmlns:aink="http://schemas.microsoft.com/office/drawing/2016/ink" xmlns:cx8="http://schemas.microsoft.com/office/drawing/2016/5/14/chartex" xmlns:cx7="http://schemas.microsoft.com/office/drawing/2016/5/13/chartex" xmlns:cx6="http://schemas.microsoft.com/office/drawing/2016/5/12/chartex" xmlns:cx5="http://schemas.microsoft.com/office/drawing/2016/5/11/chartex" xmlns:cx4="http://schemas.microsoft.com/office/drawing/2016/5/10/chartex" xmlns:cx3="http://schemas.microsoft.com/office/drawing/2016/5/9/chartex" xmlns:cx2="http://schemas.microsoft.com/office/drawing/2015/10/21/chartex" xmlns:cx1="http://schemas.microsoft.com/office/drawing/2015/9/8/chartex" xmlns:cx="http://schemas.microsoft.com/office/drawing/2014/chartex">
+        <mc:Fallback>
           <w:pict>
             <v:line w14:anchorId="1500F397" id="Straight Connector 4" o:spid="_x0000_s1026" style="position:absolute;z-index:251661312;visibility:visible;mso-wrap-style:square;mso-width-percent:0;mso-wrap-distance-left:9pt;mso-wrap-distance-top:0;mso-wrap-distance-right:9pt;mso-wrap-distance-bottom:0;mso-position-horizontal:absolute;mso-position-horizontal-relative:text;mso-position-vertical:absolute;mso-position-vertical-relative:text;mso-width-percent:0;mso-width-relative:margin" from="-43.5pt,-2.55pt" to="494.25pt,-2.55pt" o:gfxdata="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" strokecolor="#4472c4 [3204]" strokeweight="2.5pt">
               <v:stroke linestyle="thinThin" joinstyle="miter"/>
@@ -8468,7 +8141,7 @@
 </file>
 
 <file path=word/footnotes.xml><?xml version="1.0" encoding="utf-8"?>
-<w:footnotes xmlns:wpc="http://schemas.microsoft.com/office/word/2010/wordprocessingCanvas" xmlns:mc="http://schemas.openxmlformats.org/markup-compatibility/2006" xmlns:o="urn:schemas-microsoft-com:office:office" xmlns:r="http://schemas.openxmlformats.org/officeDocument/2006/relationships" xmlns:m="http://schemas.openxmlformats.org/officeDocument/2006/math" xmlns:v="urn:schemas-microsoft-com:vml" xmlns:wp14="http://schemas.microsoft.com/office/word/2010/wordprocessingDrawing" xmlns:wp="http://schemas.openxmlformats.org/drawingml/2006/wordprocessingDrawing" xmlns:w10="urn:schemas-microsoft-com:office:word" xmlns:w="http://schemas.openxmlformats.org/wordprocessingml/2006/main" xmlns:w14="http://schemas.microsoft.com/office/word/2010/wordml" xmlns:w15="http://schemas.microsoft.com/office/word/2012/wordml" xmlns:wpg="http://schemas.microsoft.com/office/word/2010/wordprocessingGroup" xmlns:wpi="http://schemas.microsoft.com/office/word/2010/wordprocessingInk" xmlns:wne="http://schemas.microsoft.com/office/word/2006/wordml" xmlns:wps="http://schemas.microsoft.com/office/word/2010/wordprocessingShape" mc:Ignorable="w14 w15 wp14">
+<w:footnotes xmlns:wpc="http://schemas.microsoft.com/office/word/2010/wordprocessingCanvas" xmlns:cx="http://schemas.microsoft.com/office/drawing/2014/chartex" xmlns:cx1="http://schemas.microsoft.com/office/drawing/2015/9/8/chartex" xmlns:cx2="http://schemas.microsoft.com/office/drawing/2015/10/21/chartex" xmlns:cx3="http://schemas.microsoft.com/office/drawing/2016/5/9/chartex" xmlns:cx4="http://schemas.microsoft.com/office/drawing/2016/5/10/chartex" xmlns:cx5="http://schemas.microsoft.com/office/drawing/2016/5/11/chartex" xmlns:cx6="http://schemas.microsoft.com/office/drawing/2016/5/12/chartex" xmlns:cx7="http://schemas.microsoft.com/office/drawing/2016/5/13/chartex" xmlns:cx8="http://schemas.microsoft.com/office/drawing/2016/5/14/chartex" xmlns:mc="http://schemas.openxmlformats.org/markup-compatibility/2006" xmlns:aink="http://schemas.microsoft.com/office/drawing/2016/ink" xmlns:am3d="http://schemas.microsoft.com/office/drawing/2017/model3d" xmlns:o="urn:schemas-microsoft-com:office:office" xmlns:oel="http://schemas.microsoft.com/office/2019/extlst" xmlns:r="http://schemas.openxmlformats.org/officeDocument/2006/relationships" xmlns:m="http://schemas.openxmlformats.org/officeDocument/2006/math" xmlns:v="urn:schemas-microsoft-com:vml" xmlns:wp14="http://schemas.microsoft.com/office/word/2010/wordprocessingDrawing" xmlns:wp="http://schemas.openxmlformats.org/drawingml/2006/wordprocessingDrawing" xmlns:w10="urn:schemas-microsoft-com:office:word" xmlns:w="http://schemas.openxmlformats.org/wordprocessingml/2006/main" xmlns:w14="http://schemas.microsoft.com/office/word/2010/wordml" xmlns:w15="http://schemas.microsoft.com/office/word/2012/wordml" xmlns:w16cex="http://schemas.microsoft.com/office/word/2018/wordml/cex" xmlns:w16cid="http://schemas.microsoft.com/office/word/2016/wordml/cid" xmlns:w16="http://schemas.microsoft.com/office/word/2018/wordml" xmlns:w16du="http://schemas.microsoft.com/office/word/2023/wordml/word16du" xmlns:w16sdtdh="http://schemas.microsoft.com/office/word/2020/wordml/sdtdatahash" xmlns:w16sdtfl="http://schemas.microsoft.com/office/word/2024/wordml/sdtformatlock" xmlns:w16se="http://schemas.microsoft.com/office/word/2015/wordml/symex" xmlns:wpg="http://schemas.microsoft.com/office/word/2010/wordprocessingGroup" xmlns:wpi="http://schemas.microsoft.com/office/word/2010/wordprocessingInk" xmlns:wne="http://schemas.microsoft.com/office/word/2006/wordml" xmlns:wps="http://schemas.microsoft.com/office/word/2010/wordprocessingShape" mc:Ignorable="w14 w15 w16se w16cid w16 w16cex w16sdtdh w16sdtfl w16du wp14">
   <w:footnote w:type="separator" w:id="-1">
     <w:p>
       <w:pPr>
@@ -8493,7 +8166,7 @@
 </file>
 
 <file path=word/header1.xml><?xml version="1.0" encoding="utf-8"?>
-<w:hdr xmlns:wpc="http://schemas.microsoft.com/office/word/2010/wordprocessingCanvas" xmlns:mc="http://schemas.openxmlformats.org/markup-compatibility/2006" xmlns:o="urn:schemas-microsoft-com:office:office" xmlns:r="http://schemas.openxmlformats.org/officeDocument/2006/relationships" xmlns:m="http://schemas.openxmlformats.org/officeDocument/2006/math" xmlns:v="urn:schemas-microsoft-com:vml" xmlns:wp14="http://schemas.microsoft.com/office/word/2010/wordprocessingDrawing" xmlns:wp="http://schemas.openxmlformats.org/drawingml/2006/wordprocessingDrawing" xmlns:w10="urn:schemas-microsoft-com:office:word" xmlns:w="http://schemas.openxmlformats.org/wordprocessingml/2006/main" xmlns:w14="http://schemas.microsoft.com/office/word/2010/wordml" xmlns:w15="http://schemas.microsoft.com/office/word/2012/wordml" xmlns:wpg="http://schemas.microsoft.com/office/word/2010/wordprocessingGroup" xmlns:wpi="http://schemas.microsoft.com/office/word/2010/wordprocessingInk" xmlns:wne="http://schemas.microsoft.com/office/word/2006/wordml" xmlns:wps="http://schemas.microsoft.com/office/word/2010/wordprocessingShape" mc:Ignorable="w14 w15 wp14">
+<w:hdr xmlns:wpc="http://schemas.microsoft.com/office/word/2010/wordprocessingCanvas" xmlns:cx="http://schemas.microsoft.com/office/drawing/2014/chartex" xmlns:cx1="http://schemas.microsoft.com/office/drawing/2015/9/8/chartex" xmlns:cx2="http://schemas.microsoft.com/office/drawing/2015/10/21/chartex" xmlns:cx3="http://schemas.microsoft.com/office/drawing/2016/5/9/chartex" xmlns:cx4="http://schemas.microsoft.com/office/drawing/2016/5/10/chartex" xmlns:cx5="http://schemas.microsoft.com/office/drawing/2016/5/11/chartex" xmlns:cx6="http://schemas.microsoft.com/office/drawing/2016/5/12/chartex" xmlns:cx7="http://schemas.microsoft.com/office/drawing/2016/5/13/chartex" xmlns:cx8="http://schemas.microsoft.com/office/drawing/2016/5/14/chartex" xmlns:mc="http://schemas.openxmlformats.org/markup-compatibility/2006" xmlns:aink="http://schemas.microsoft.com/office/drawing/2016/ink" xmlns:am3d="http://schemas.microsoft.com/office/drawing/2017/model3d" xmlns:o="urn:schemas-microsoft-com:office:office" xmlns:oel="http://schemas.microsoft.com/office/2019/extlst" xmlns:r="http://schemas.openxmlformats.org/officeDocument/2006/relationships" xmlns:m="http://schemas.openxmlformats.org/officeDocument/2006/math" xmlns:v="urn:schemas-microsoft-com:vml" xmlns:wp14="http://schemas.microsoft.com/office/word/2010/wordprocessingDrawing" xmlns:wp="http://schemas.openxmlformats.org/drawingml/2006/wordprocessingDrawing" xmlns:w10="urn:schemas-microsoft-com:office:word" xmlns:w="http://schemas.openxmlformats.org/wordprocessingml/2006/main" xmlns:w14="http://schemas.microsoft.com/office/word/2010/wordml" xmlns:w15="http://schemas.microsoft.com/office/word/2012/wordml" xmlns:w16cex="http://schemas.microsoft.com/office/word/2018/wordml/cex" xmlns:w16cid="http://schemas.microsoft.com/office/word/2016/wordml/cid" xmlns:w16="http://schemas.microsoft.com/office/word/2018/wordml" xmlns:w16du="http://schemas.microsoft.com/office/word/2023/wordml/word16du" xmlns:w16sdtdh="http://schemas.microsoft.com/office/word/2020/wordml/sdtdatahash" xmlns:w16sdtfl="http://schemas.microsoft.com/office/word/2024/wordml/sdtformatlock" xmlns:w16se="http://schemas.microsoft.com/office/word/2015/wordml/symex" xmlns:wpg="http://schemas.microsoft.com/office/word/2010/wordprocessingGroup" xmlns:wpi="http://schemas.microsoft.com/office/word/2010/wordprocessingInk" xmlns:wne="http://schemas.microsoft.com/office/word/2006/wordml" xmlns:wps="http://schemas.microsoft.com/office/word/2010/wordprocessingShape" mc:Ignorable="w14 w15 w16se w16cid w16 w16cex w16sdtdh w16sdtfl w16du wp14">
   <w:p>
     <w:pPr>
       <w:pStyle w:val="Header"/>
@@ -8573,7 +8246,7 @@
             </wp:anchor>
           </w:drawing>
         </mc:Choice>
-        <mc:Fallback xmlns:w16se="http://schemas.microsoft.com/office/word/2015/wordml/symex" xmlns:w16sdtdh="http://schemas.microsoft.com/office/word/2020/wordml/sdtdatahash" xmlns:w16="http://schemas.microsoft.com/office/word/2018/wordml" xmlns:w16cid="http://schemas.microsoft.com/office/word/2016/wordml/cid" xmlns:w16cex="http://schemas.microsoft.com/office/word/2018/wordml/cex" xmlns:am3d="http://schemas.microsoft.com/office/drawing/2017/model3d" xmlns:aink="http://schemas.microsoft.com/office/drawing/2016/ink" xmlns:cx8="http://schemas.microsoft.com/office/drawing/2016/5/14/chartex" xmlns:cx7="http://schemas.microsoft.com/office/drawing/2016/5/13/chartex" xmlns:cx6="http://schemas.microsoft.com/office/drawing/2016/5/12/chartex" xmlns:cx5="http://schemas.microsoft.com/office/drawing/2016/5/11/chartex" xmlns:cx4="http://schemas.microsoft.com/office/drawing/2016/5/10/chartex" xmlns:cx3="http://schemas.microsoft.com/office/drawing/2016/5/9/chartex" xmlns:cx2="http://schemas.microsoft.com/office/drawing/2015/10/21/chartex" xmlns:cx1="http://schemas.microsoft.com/office/drawing/2015/9/8/chartex" xmlns:cx="http://schemas.microsoft.com/office/drawing/2014/chartex">
+        <mc:Fallback>
           <w:pict>
             <v:line w14:anchorId="7CFB6F92" id="Straight Connector 3" o:spid="_x0000_s1026" style="position:absolute;z-index:251659264;visibility:visible;mso-wrap-style:square;mso-width-percent:0;mso-wrap-distance-left:9pt;mso-wrap-distance-top:0;mso-wrap-distance-right:9pt;mso-wrap-distance-bottom:0;mso-position-horizontal:absolute;mso-position-horizontal-relative:text;mso-position-vertical:absolute;mso-position-vertical-relative:text;mso-width-percent:0;mso-width-relative:margin" from="-43.65pt,14.2pt" to="493.5pt,14.2pt" o:gfxdata="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" strokecolor="#4472c4 [3204]" strokeweight="2.5pt">
               <v:stroke linestyle="thinThin" joinstyle="miter"/>
@@ -8642,8 +8315,8 @@
 </file>
 
 <file path=word/numbering.xml><?xml version="1.0" encoding="utf-8"?>
-<w:numbering xmlns:wpc="http://schemas.microsoft.com/office/word/2010/wordprocessingCanvas" xmlns:mc="http://schemas.openxmlformats.org/markup-compatibility/2006" xmlns:o="urn:schemas-microsoft-com:office:office" xmlns:r="http://schemas.openxmlformats.org/officeDocument/2006/relationships" xmlns:m="http://schemas.openxmlformats.org/officeDocument/2006/math" xmlns:v="urn:schemas-microsoft-com:vml" xmlns:wp14="http://schemas.microsoft.com/office/word/2010/wordprocessingDrawing" xmlns:wp="http://schemas.openxmlformats.org/drawingml/2006/wordprocessingDrawing" xmlns:w10="urn:schemas-microsoft-com:office:word" xmlns:w="http://schemas.openxmlformats.org/wordprocessingml/2006/main" xmlns:w14="http://schemas.microsoft.com/office/word/2010/wordml" xmlns:w15="http://schemas.microsoft.com/office/word/2012/wordml" xmlns:wpg="http://schemas.microsoft.com/office/word/2010/wordprocessingGroup" xmlns:wpi="http://schemas.microsoft.com/office/word/2010/wordprocessingInk" xmlns:wne="http://schemas.microsoft.com/office/word/2006/wordml" xmlns:wps="http://schemas.microsoft.com/office/word/2010/wordprocessingShape" mc:Ignorable="w14 w15 wp14">
-  <w:abstractNum w:abstractNumId="0">
+<w:numbering xmlns:wpc="http://schemas.microsoft.com/office/word/2010/wordprocessingCanvas" xmlns:cx="http://schemas.microsoft.com/office/drawing/2014/chartex" xmlns:cx1="http://schemas.microsoft.com/office/drawing/2015/9/8/chartex" xmlns:cx2="http://schemas.microsoft.com/office/drawing/2015/10/21/chartex" xmlns:cx3="http://schemas.microsoft.com/office/drawing/2016/5/9/chartex" xmlns:cx4="http://schemas.microsoft.com/office/drawing/2016/5/10/chartex" xmlns:cx5="http://schemas.microsoft.com/office/drawing/2016/5/11/chartex" xmlns:cx6="http://schemas.microsoft.com/office/drawing/2016/5/12/chartex" xmlns:cx7="http://schemas.microsoft.com/office/drawing/2016/5/13/chartex" xmlns:cx8="http://schemas.microsoft.com/office/drawing/2016/5/14/chartex" xmlns:mc="http://schemas.openxmlformats.org/markup-compatibility/2006" xmlns:aink="http://schemas.microsoft.com/office/drawing/2016/ink" xmlns:am3d="http://schemas.microsoft.com/office/drawing/2017/model3d" xmlns:o="urn:schemas-microsoft-com:office:office" xmlns:oel="http://schemas.microsoft.com/office/2019/extlst" xmlns:r="http://schemas.openxmlformats.org/officeDocument/2006/relationships" xmlns:m="http://schemas.openxmlformats.org/officeDocument/2006/math" xmlns:v="urn:schemas-microsoft-com:vml" xmlns:wp14="http://schemas.microsoft.com/office/word/2010/wordprocessingDrawing" xmlns:wp="http://schemas.openxmlformats.org/drawingml/2006/wordprocessingDrawing" xmlns:w10="urn:schemas-microsoft-com:office:word" xmlns:w="http://schemas.openxmlformats.org/wordprocessingml/2006/main" xmlns:w14="http://schemas.microsoft.com/office/word/2010/wordml" xmlns:w15="http://schemas.microsoft.com/office/word/2012/wordml" xmlns:w16cex="http://schemas.microsoft.com/office/word/2018/wordml/cex" xmlns:w16cid="http://schemas.microsoft.com/office/word/2016/wordml/cid" xmlns:w16="http://schemas.microsoft.com/office/word/2018/wordml" xmlns:w16du="http://schemas.microsoft.com/office/word/2023/wordml/word16du" xmlns:w16sdtdh="http://schemas.microsoft.com/office/word/2020/wordml/sdtdatahash" xmlns:w16sdtfl="http://schemas.microsoft.com/office/word/2024/wordml/sdtformatlock" xmlns:w16se="http://schemas.microsoft.com/office/word/2015/wordml/symex" xmlns:wpg="http://schemas.microsoft.com/office/word/2010/wordprocessingGroup" xmlns:wpi="http://schemas.microsoft.com/office/word/2010/wordprocessingInk" xmlns:wne="http://schemas.microsoft.com/office/word/2006/wordml" xmlns:wps="http://schemas.microsoft.com/office/word/2010/wordprocessingShape" mc:Ignorable="w14 w15 w16se w16cid w16 w16cex w16sdtdh w16sdtfl w16du wp14">
+  <w:abstractNum w:abstractNumId="0" w15:restartNumberingAfterBreak="0">
     <w:nsid w:val="14F5385B"/>
     <w:multiLevelType w:val="hybridMultilevel"/>
     <w:tmpl w:val="378C4C36"/>
@@ -8732,7 +8405,7 @@
       </w:pPr>
     </w:lvl>
   </w:abstractNum>
-  <w:abstractNum w:abstractNumId="1">
+  <w:abstractNum w:abstractNumId="1" w15:restartNumberingAfterBreak="0">
     <w:nsid w:val="24297AA9"/>
     <w:multiLevelType w:val="multilevel"/>
     <w:tmpl w:val="E1145110"/>
@@ -8845,7 +8518,7 @@
       </w:pPr>
     </w:lvl>
   </w:abstractNum>
-  <w:abstractNum w:abstractNumId="2">
+  <w:abstractNum w:abstractNumId="2" w15:restartNumberingAfterBreak="0">
     <w:nsid w:val="29DF02D1"/>
     <w:multiLevelType w:val="multilevel"/>
     <w:tmpl w:val="751C327E"/>
@@ -8958,7 +8631,7 @@
       </w:pPr>
     </w:lvl>
   </w:abstractNum>
-  <w:abstractNum w:abstractNumId="3">
+  <w:abstractNum w:abstractNumId="3" w15:restartNumberingAfterBreak="0">
     <w:nsid w:val="2B5063FE"/>
     <w:multiLevelType w:val="hybridMultilevel"/>
     <w:tmpl w:val="A1F4A7C0"/>
@@ -9047,7 +8720,7 @@
       </w:pPr>
     </w:lvl>
   </w:abstractNum>
-  <w:abstractNum w:abstractNumId="4">
+  <w:abstractNum w:abstractNumId="4" w15:restartNumberingAfterBreak="0">
     <w:nsid w:val="43705215"/>
     <w:multiLevelType w:val="multilevel"/>
     <w:tmpl w:val="7E62F4C0"/>
@@ -9160,7 +8833,7 @@
       </w:pPr>
     </w:lvl>
   </w:abstractNum>
-  <w:abstractNum w:abstractNumId="5">
+  <w:abstractNum w:abstractNumId="5" w15:restartNumberingAfterBreak="0">
     <w:nsid w:val="49CD7593"/>
     <w:multiLevelType w:val="multilevel"/>
     <w:tmpl w:val="4BE26FC8"/>
@@ -9276,7 +8949,7 @@
       </w:pPr>
     </w:lvl>
   </w:abstractNum>
-  <w:abstractNum w:abstractNumId="6">
+  <w:abstractNum w:abstractNumId="6" w15:restartNumberingAfterBreak="0">
     <w:nsid w:val="6F1B3068"/>
     <w:multiLevelType w:val="multilevel"/>
     <w:tmpl w:val="A02AF2EE"/>
@@ -9389,32 +9062,32 @@
       </w:pPr>
     </w:lvl>
   </w:abstractNum>
-  <w:num w:numId="1">
+  <w:num w:numId="1" w16cid:durableId="1242913087">
     <w:abstractNumId w:val="1"/>
   </w:num>
-  <w:num w:numId="2">
+  <w:num w:numId="2" w16cid:durableId="1083794510">
     <w:abstractNumId w:val="6"/>
   </w:num>
-  <w:num w:numId="3">
+  <w:num w:numId="3" w16cid:durableId="802693042">
     <w:abstractNumId w:val="2"/>
   </w:num>
-  <w:num w:numId="4">
+  <w:num w:numId="4" w16cid:durableId="960652309">
     <w:abstractNumId w:val="4"/>
   </w:num>
-  <w:num w:numId="5">
+  <w:num w:numId="5" w16cid:durableId="1959946958">
     <w:abstractNumId w:val="5"/>
   </w:num>
-  <w:num w:numId="6">
+  <w:num w:numId="6" w16cid:durableId="1290473328">
     <w:abstractNumId w:val="0"/>
   </w:num>
-  <w:num w:numId="7">
+  <w:num w:numId="7" w16cid:durableId="108596636">
     <w:abstractNumId w:val="3"/>
   </w:num>
 </w:numbering>
 </file>
 
 <file path=word/styles.xml><?xml version="1.0" encoding="utf-8"?>
-<w:styles xmlns:mc="http://schemas.openxmlformats.org/markup-compatibility/2006" xmlns:r="http://schemas.openxmlformats.org/officeDocument/2006/relationships" xmlns:w="http://schemas.openxmlformats.org/wordprocessingml/2006/main" xmlns:w14="http://schemas.microsoft.com/office/word/2010/wordml" xmlns:w15="http://schemas.microsoft.com/office/word/2012/wordml" mc:Ignorable="w14 w15">
+<w:styles xmlns:mc="http://schemas.openxmlformats.org/markup-compatibility/2006" xmlns:r="http://schemas.openxmlformats.org/officeDocument/2006/relationships" xmlns:w="http://schemas.openxmlformats.org/wordprocessingml/2006/main" xmlns:w14="http://schemas.microsoft.com/office/word/2010/wordml" xmlns:w15="http://schemas.microsoft.com/office/word/2012/wordml" xmlns:w16cex="http://schemas.microsoft.com/office/word/2018/wordml/cex" xmlns:w16cid="http://schemas.microsoft.com/office/word/2016/wordml/cid" xmlns:w16="http://schemas.microsoft.com/office/word/2018/wordml" xmlns:w16du="http://schemas.microsoft.com/office/word/2023/wordml/word16du" xmlns:w16sdtdh="http://schemas.microsoft.com/office/word/2020/wordml/sdtdatahash" xmlns:w16sdtfl="http://schemas.microsoft.com/office/word/2024/wordml/sdtformatlock" xmlns:w16se="http://schemas.microsoft.com/office/word/2015/wordml/symex" mc:Ignorable="w14 w15 w16se w16cid w16 w16cex w16sdtdh w16sdtfl w16du">
   <w:docDefaults>
     <w:rPrDefault>
       <w:rPr>
@@ -9429,7 +9102,7 @@
       </w:pPr>
     </w:pPrDefault>
   </w:docDefaults>
-  <w:latentStyles w:defLockedState="0" w:defUIPriority="99" w:defSemiHidden="0" w:defUnhideWhenUsed="0" w:defQFormat="0" w:count="371">
+  <w:latentStyles w:defLockedState="0" w:defUIPriority="99" w:defSemiHidden="0" w:defUnhideWhenUsed="0" w:defQFormat="0" w:count="376">
     <w:lsdException w:name="Normal" w:uiPriority="0" w:qFormat="1"/>
     <w:lsdException w:name="heading 1" w:uiPriority="9" w:qFormat="1"/>
     <w:lsdException w:name="heading 2" w:semiHidden="1" w:uiPriority="9" w:unhideWhenUsed="1" w:qFormat="1"/>
@@ -9801,6 +9474,11 @@
     <w:lsdException w:name="List Table 5 Dark Accent 6" w:uiPriority="50"/>
     <w:lsdException w:name="List Table 6 Colorful Accent 6" w:uiPriority="51"/>
     <w:lsdException w:name="List Table 7 Colorful Accent 6" w:uiPriority="52"/>
+    <w:lsdException w:name="Mention" w:semiHidden="1" w:unhideWhenUsed="1"/>
+    <w:lsdException w:name="Smart Hyperlink" w:semiHidden="1" w:unhideWhenUsed="1"/>
+    <w:lsdException w:name="Hashtag" w:semiHidden="1" w:unhideWhenUsed="1"/>
+    <w:lsdException w:name="Unresolved Mention" w:semiHidden="1" w:unhideWhenUsed="1"/>
+    <w:lsdException w:name="Smart Link" w:semiHidden="1" w:unhideWhenUsed="1"/>
   </w:latentStyles>
   <w:style w:type="paragraph" w:default="1" w:styleId="Normal">
     <w:name w:val="Normal"/>
@@ -9897,7 +9575,6 @@
       <w:lang w:val="en-IN" w:bidi="ar-SA"/>
     </w:rPr>
     <w:tblPr>
-      <w:tblInd w:w="0" w:type="dxa"/>
       <w:tblBorders>
         <w:top w:val="single" w:sz="4" w:space="0" w:color="auto"/>
         <w:left w:val="single" w:sz="4" w:space="0" w:color="auto"/>
@@ -9906,12 +9583,6 @@
         <w:insideH w:val="single" w:sz="4" w:space="0" w:color="auto"/>
         <w:insideV w:val="single" w:sz="4" w:space="0" w:color="auto"/>
       </w:tblBorders>
-      <w:tblCellMar>
-        <w:top w:w="0" w:type="dxa"/>
-        <w:left w:w="108" w:type="dxa"/>
-        <w:bottom w:w="0" w:type="dxa"/>
-        <w:right w:w="108" w:type="dxa"/>
-      </w:tblCellMar>
     </w:tblPr>
   </w:style>
   <w:style w:type="paragraph" w:styleId="Header">

</xml_diff>